<commit_message>
Paper: Sec. VI-C says the app serves KNN and DT; Table IV note re-labels the LR figures
build_paper.py: Sec. VI-C now says the application serves both models, explaining KNN
predictions by the nearest labelled training buildings and DT predictions by their
root-to-leaf path in raw feature units, shown in the Case File. The Table IV note keeps
LR 0.527/0.290 but calls them saved results from an earlier version of the pipeline that
included logistic regression, not trained by the current pipeline. The Sec. VI
confounding sentence is unchanged.

DOCX and PDF rebuilt (PDF via LibreOffice): the text differs from the previous build only
in those two places plus line reflow, the six embedded figures are byte-identical, and
it is still 5 pages. PAPER_CONSISTENCY_AUDIT (incl. screenshot names), PAPER_CHANGELOG
(change 7) and paper/evidence_register.md updated to match.

Co-Authored-By: Claude Opus 5.5 <noreply@anthropic.com>
</commit_message>
<xml_diff>
--- a/docs/research/AfterSight_Final_Research_Paper.docx
+++ b/docs/research/AfterSight_Final_Research_Paper.docx
@@ -4428,7 +4428,7 @@
         <w:rPr>
           <w:sz w:val="14"/>
         </w:rPr>
-        <w:t>For context only, other models trained in the same pipeline score (within/cross macro-F1): logistic regression 0.527/0.290, random forest 0.546/0.291, one-feature threshold rule 0.383/0.193.</w:t>
+        <w:t>For context only, other models score (within/cross macro-F1): logistic regression 0.527/0.290 (saved results from an earlier version of the pipeline that included logistic regression; it is not trained by the current pipeline), random forest 0.546/0.291, one-feature threshold rule 0.383/0.193.</w:t>
       </w:r>
     </w:p>
     <w:p>
@@ -6248,7 +6248,7 @@
         <w:jc w:val="both"/>
       </w:pPr>
       <w:r>
-        <w:t>The models also differ in cost and explanation. On our hardware, test inference took 19.7 ms per 1,000 buildings for KNN, which compares each query with all 49,929 training buildings, versus 0.27 ms for the DT (single measurements). The AfterSight application explains a KNN prediction by its nearest labelled training buildings. The DT root-to-leaf paths in raw feature units are reported in this study from the saved research models and shown in the application's Model Arena tree view, but the DT is not served for live predictions.</w:t>
+        <w:t>The models also differ in cost and explanation. On our hardware, test inference took 19.7 ms per 1,000 buildings for KNN, which compares each query with all 49,929 training buildings, versus 0.27 ms for the DT (single measurements). The AfterSight application serves both models: it explains a KNN prediction by its nearest labelled training buildings and a DT prediction by its root-to-leaf path in raw feature units, shown in the application's Case File.</w:t>
       </w:r>
     </w:p>
     <w:p>

</xml_diff>